<commit_message>
Fix ParagraphFormat being wiped before paragraph flush
  ProcessElement assigned context.ParagraphFormat from inline CSS and then
  called FlushParagraph, which clears the format on both code paths. By
  the time the paragraph's runs were flushed, the format was null and
  ApplyParagraphFormat never ran — so margins, text-align, line-height,
  text-indent, borders, background-color, and writing-mode declared on
  block elements silently produced no <w:pPr> output.

  Defer the assignment until after the flush, matching the existing
  ordering for HeadingLevel and ParagraphStyleId. Refresh 25 verified
  baselines that had locked in the broken (no-pPr) output.
</commit_message>
<xml_diff>
--- a/src/OpenXmlHtml.Tests/Samples/WordSamples.HeadersAndFooters.DotNet.verified.docx
+++ b/src/OpenXmlHtml.Tests/Samples/WordSamples.HeadersAndFooters.DotNet.verified.docx
@@ -20,6 +20,9 @@
 <file path=word/footer1.xml><?xml version="1.0" encoding="utf-8"?>
 <w:ftr xmlns:w="http://schemas.openxmlformats.org/wordprocessingml/2006/main">
   <w:p>
+    <w:pPr>
+      <w:jc w:val="center"/>
+    </w:pPr>
     <w:r>
       <w:rPr>
         <w:color w:val="808080"/>
@@ -34,6 +37,9 @@
 <file path=word/header1.xml><?xml version="1.0" encoding="utf-8"?>
 <w:hdr xmlns:w="http://schemas.openxmlformats.org/wordprocessingml/2006/main">
   <w:p>
+    <w:pPr>
+      <w:jc w:val="center"/>
+    </w:pPr>
     <w:r>
       <w:rPr>
         <w:b/>

</xml_diff>

<commit_message>
Fix ParagraphFormat being wiped before paragraph flush (#11)
ProcessElement assigned context.ParagraphFormat from inline CSS and then
  called FlushParagraph, which clears the format on both code paths. By
  the time the paragraph's runs were flushed, the format was null and
  ApplyParagraphFormat never ran — so margins, text-align, line-height,
  text-indent, borders, background-color, and writing-mode declared on
  block elements silently produced no <w:pPr> output.

  Defer the assignment until after the flush, matching the existing
  ordering for HeadingLevel and ParagraphStyleId. Refresh 25 verified
  baselines that had locked in the broken (no-pPr) output.
</commit_message>
<xml_diff>
--- a/src/OpenXmlHtml.Tests/Samples/WordSamples.HeadersAndFooters.DotNet.verified.docx
+++ b/src/OpenXmlHtml.Tests/Samples/WordSamples.HeadersAndFooters.DotNet.verified.docx
@@ -20,6 +20,9 @@
 <file path=word/footer1.xml><?xml version="1.0" encoding="utf-8"?>
 <w:ftr xmlns:w="http://schemas.openxmlformats.org/wordprocessingml/2006/main">
   <w:p>
+    <w:pPr>
+      <w:jc w:val="center"/>
+    </w:pPr>
     <w:r>
       <w:rPr>
         <w:color w:val="808080"/>
@@ -34,6 +37,9 @@
 <file path=word/header1.xml><?xml version="1.0" encoding="utf-8"?>
 <w:hdr xmlns:w="http://schemas.openxmlformats.org/wordprocessingml/2006/main">
   <w:p>
+    <w:pPr>
+      <w:jc w:val="center"/>
+    </w:pPr>
     <w:r>
       <w:rPr>
         <w:b/>

</xml_diff>